<commit_message>
Refine PDF report formatting and figure embedding
- Adjusted table widths and font sizes for improved layout in "TABLE X".
- Updated footer text to a more concise title.
- Modified heading spacing for better visual hierarchy.
- Implemented conditional page breaks for specific headings.
- Reduced paragraph spacing in various sections for a cleaner look.
- Enhanced figure embedding with calibrated widths to optimize layout and prevent blank spaces.
</commit_message>
<xml_diff>
--- a/report/REPORT.docx
+++ b/report/REPORT.docx
@@ -548,7 +548,7 @@
                 <w:color w:val="000000"/>
                 <w:sz w:val="16"/>
               </w:rPr>
-              <w:t>Page 10</w:t>
+              <w:t>Page 9</w:t>
             </w:r>
           </w:p>
         </w:tc>
@@ -626,7 +626,7 @@
                 <w:color w:val="000000"/>
                 <w:sz w:val="16"/>
               </w:rPr>
-              <w:t>Page 12</w:t>
+              <w:t>Page 11</w:t>
             </w:r>
           </w:p>
         </w:tc>
@@ -704,7 +704,7 @@
                 <w:color w:val="000000"/>
                 <w:sz w:val="16"/>
               </w:rPr>
-              <w:t>Page 15</w:t>
+              <w:t>Page 13</w:t>
             </w:r>
           </w:p>
         </w:tc>
@@ -782,7 +782,7 @@
                 <w:color w:val="000000"/>
                 <w:sz w:val="16"/>
               </w:rPr>
-              <w:t>Page 16</w:t>
+              <w:t>Page 14</w:t>
             </w:r>
           </w:p>
         </w:tc>
@@ -860,7 +860,7 @@
                 <w:color w:val="000000"/>
                 <w:sz w:val="16"/>
               </w:rPr>
-              <w:t>Page 17</w:t>
+              <w:t>Page 15</w:t>
             </w:r>
           </w:p>
         </w:tc>
@@ -938,7 +938,7 @@
                 <w:color w:val="000000"/>
                 <w:sz w:val="16"/>
               </w:rPr>
-              <w:t>Page 18</w:t>
+              <w:t>Page 16</w:t>
             </w:r>
           </w:p>
         </w:tc>
@@ -1016,7 +1016,7 @@
                 <w:color w:val="000000"/>
                 <w:sz w:val="16"/>
               </w:rPr>
-              <w:t>Page 20</w:t>
+              <w:t>Page 17</w:t>
             </w:r>
           </w:p>
         </w:tc>
@@ -1159,13 +1159,9 @@
       </w:r>
     </w:p>
     <w:p>
-      <w:r>
-        <w:br w:type="page"/>
-      </w:r>
-    </w:p>
-    <w:p>
       <w:pPr>
         <w:keepNext/>
+        <w:pageBreakBefore/>
         <w:spacing w:before="280" w:after="80"/>
         <w:jc w:val="center"/>
       </w:pPr>
@@ -1270,7 +1266,7 @@
     <w:p>
       <w:pPr>
         <w:keepNext/>
-        <w:spacing w:before="180" w:after="60"/>
+        <w:spacing w:before="140" w:after="40"/>
         <w:jc w:val="left"/>
       </w:pPr>
       <w:r>
@@ -1410,7 +1406,7 @@
           </w:tcPr>
           <w:p>
             <w:pPr>
-              <w:spacing w:before="80" w:after="80"/>
+              <w:spacing w:before="40" w:after="40"/>
               <w:jc w:val="center"/>
             </w:pPr>
             <m:oMath>
@@ -1527,7 +1523,7 @@
           </w:tcPr>
           <w:p>
             <w:pPr>
-              <w:spacing w:before="80" w:after="80"/>
+              <w:spacing w:before="40" w:after="40"/>
               <w:jc w:val="right"/>
             </w:pPr>
             <w:r>
@@ -1729,7 +1725,7 @@
           </w:tcPr>
           <w:p>
             <w:pPr>
-              <w:spacing w:before="80" w:after="80"/>
+              <w:spacing w:before="40" w:after="40"/>
               <w:jc w:val="center"/>
             </w:pPr>
             <m:oMath>
@@ -1807,7 +1803,7 @@
           </w:tcPr>
           <w:p>
             <w:pPr>
-              <w:spacing w:before="80" w:after="80"/>
+              <w:spacing w:before="40" w:after="40"/>
               <w:jc w:val="right"/>
             </w:pPr>
             <w:r>
@@ -1916,7 +1912,7 @@
           </w:tcPr>
           <w:p>
             <w:pPr>
-              <w:spacing w:before="80" w:after="80"/>
+              <w:spacing w:before="40" w:after="40"/>
               <w:jc w:val="center"/>
             </w:pPr>
             <m:oMath>
@@ -1994,7 +1990,7 @@
           </w:tcPr>
           <w:p>
             <w:pPr>
-              <w:spacing w:before="80" w:after="80"/>
+              <w:spacing w:before="40" w:after="40"/>
               <w:jc w:val="right"/>
             </w:pPr>
             <w:r>
@@ -2012,7 +2008,7 @@
     <w:p>
       <w:pPr>
         <w:keepNext/>
-        <w:spacing w:before="180" w:after="60"/>
+        <w:spacing w:before="140" w:after="40"/>
         <w:jc w:val="left"/>
       </w:pPr>
       <w:r>
@@ -2094,7 +2090,7 @@
           </w:tcPr>
           <w:p>
             <w:pPr>
-              <w:spacing w:before="80" w:after="80"/>
+              <w:spacing w:before="40" w:after="40"/>
               <w:jc w:val="center"/>
             </w:pPr>
             <m:oMath>
@@ -2246,7 +2242,7 @@
           </w:tcPr>
           <w:p>
             <w:pPr>
-              <w:spacing w:before="80" w:after="80"/>
+              <w:spacing w:before="40" w:after="40"/>
               <w:jc w:val="right"/>
             </w:pPr>
             <w:r>
@@ -2427,7 +2423,7 @@
           </w:tcPr>
           <w:p>
             <w:pPr>
-              <w:spacing w:before="80" w:after="80"/>
+              <w:spacing w:before="40" w:after="40"/>
               <w:jc w:val="center"/>
             </w:pPr>
             <m:oMath>
@@ -2530,7 +2526,7 @@
           </w:tcPr>
           <w:p>
             <w:pPr>
-              <w:spacing w:before="80" w:after="80"/>
+              <w:spacing w:before="40" w:after="40"/>
               <w:jc w:val="right"/>
             </w:pPr>
             <w:r>
@@ -2613,7 +2609,7 @@
           </w:tcPr>
           <w:p>
             <w:pPr>
-              <w:spacing w:before="80" w:after="80"/>
+              <w:spacing w:before="40" w:after="40"/>
               <w:jc w:val="center"/>
             </w:pPr>
             <m:oMath>
@@ -2680,7 +2676,7 @@
           </w:tcPr>
           <w:p>
             <w:pPr>
-              <w:spacing w:before="80" w:after="80"/>
+              <w:spacing w:before="40" w:after="40"/>
               <w:jc w:val="right"/>
             </w:pPr>
             <w:r>
@@ -2698,7 +2694,7 @@
     <w:p>
       <w:pPr>
         <w:keepNext/>
-        <w:spacing w:before="180" w:after="60"/>
+        <w:spacing w:before="140" w:after="40"/>
         <w:jc w:val="left"/>
       </w:pPr>
       <w:r>
@@ -2752,7 +2748,7 @@
           </w:tcPr>
           <w:p>
             <w:pPr>
-              <w:spacing w:before="80" w:after="80"/>
+              <w:spacing w:before="40" w:after="40"/>
               <w:jc w:val="center"/>
             </w:pPr>
             <m:oMath>
@@ -3026,7 +3022,7 @@
           </w:tcPr>
           <w:p>
             <w:pPr>
-              <w:spacing w:before="80" w:after="80"/>
+              <w:spacing w:before="40" w:after="40"/>
               <w:jc w:val="right"/>
             </w:pPr>
             <w:r>
@@ -3044,7 +3040,7 @@
     <w:p>
       <w:pPr>
         <w:keepNext/>
-        <w:spacing w:before="180" w:after="60"/>
+        <w:spacing w:before="140" w:after="40"/>
         <w:jc w:val="left"/>
       </w:pPr>
       <w:r>
@@ -3098,7 +3094,7 @@
           </w:tcPr>
           <w:p>
             <w:pPr>
-              <w:spacing w:before="80" w:after="80"/>
+              <w:spacing w:before="40" w:after="40"/>
               <w:jc w:val="center"/>
             </w:pPr>
             <m:oMath>
@@ -3265,7 +3261,7 @@
           </w:tcPr>
           <w:p>
             <w:pPr>
-              <w:spacing w:before="80" w:after="80"/>
+              <w:spacing w:before="40" w:after="40"/>
               <w:jc w:val="right"/>
             </w:pPr>
             <w:r>
@@ -3320,7 +3316,7 @@
           </w:tcPr>
           <w:p>
             <w:pPr>
-              <w:spacing w:before="80" w:after="80"/>
+              <w:spacing w:before="40" w:after="40"/>
               <w:jc w:val="center"/>
             </w:pPr>
             <m:oMath>
@@ -3381,7 +3377,7 @@
           </w:tcPr>
           <w:p>
             <w:pPr>
-              <w:spacing w:before="80" w:after="80"/>
+              <w:spacing w:before="40" w:after="40"/>
               <w:jc w:val="right"/>
             </w:pPr>
             <w:r>
@@ -3461,7 +3457,7 @@
     <w:p>
       <w:pPr>
         <w:keepNext/>
-        <w:spacing w:before="180" w:after="60"/>
+        <w:spacing w:before="140" w:after="40"/>
         <w:jc w:val="left"/>
       </w:pPr>
       <w:r>
@@ -3562,7 +3558,7 @@
           </w:tcPr>
           <w:p>
             <w:pPr>
-              <w:spacing w:before="80" w:after="80"/>
+              <w:spacing w:before="40" w:after="40"/>
               <w:jc w:val="center"/>
             </w:pPr>
             <m:oMath>
@@ -3677,7 +3673,7 @@
           </w:tcPr>
           <w:p>
             <w:pPr>
-              <w:spacing w:before="80" w:after="80"/>
+              <w:spacing w:before="40" w:after="40"/>
               <w:jc w:val="right"/>
             </w:pPr>
             <w:r>
@@ -3732,7 +3728,7 @@
           </w:tcPr>
           <w:p>
             <w:pPr>
-              <w:spacing w:before="80" w:after="80"/>
+              <w:spacing w:before="40" w:after="40"/>
               <w:jc w:val="center"/>
             </w:pPr>
             <m:oMath>
@@ -3965,7 +3961,7 @@
           </w:tcPr>
           <w:p>
             <w:pPr>
-              <w:spacing w:before="80" w:after="80"/>
+              <w:spacing w:before="40" w:after="40"/>
               <w:jc w:val="right"/>
             </w:pPr>
             <w:r>
@@ -3981,13 +3977,9 @@
       </w:tr>
     </w:tbl>
     <w:p>
-      <w:r>
-        <w:br w:type="page"/>
-      </w:r>
-    </w:p>
-    <w:p>
       <w:pPr>
         <w:keepNext/>
+        <w:pageBreakBefore/>
         <w:spacing w:before="280" w:after="80"/>
         <w:jc w:val="center"/>
       </w:pPr>
@@ -4004,7 +3996,7 @@
     <w:p>
       <w:pPr>
         <w:keepNext/>
-        <w:spacing w:before="180" w:after="60"/>
+        <w:spacing w:before="140" w:after="40"/>
         <w:jc w:val="left"/>
       </w:pPr>
       <w:r>
@@ -4789,7 +4781,7 @@
     <w:p>
       <w:pPr>
         <w:keepNext/>
-        <w:spacing w:before="180" w:after="60"/>
+        <w:spacing w:before="140" w:after="40"/>
         <w:jc w:val="left"/>
       </w:pPr>
       <w:r>
@@ -7056,13 +7048,13 @@
     <w:p>
       <w:pPr>
         <w:keepNext/>
-        <w:spacing w:before="160" w:after="60"/>
+        <w:spacing w:before="80" w:after="40"/>
         <w:jc w:val="center"/>
       </w:pPr>
       <w:r>
         <w:drawing>
           <wp:inline xmlns:a="http://schemas.openxmlformats.org/drawingml/2006/main" xmlns:pic="http://schemas.openxmlformats.org/drawingml/2006/picture">
-            <wp:extent cx="5303520" cy="2651760"/>
+            <wp:extent cx="3931920" cy="1965960"/>
             <wp:docPr id="1" name="Picture 1"/>
             <wp:cNvGraphicFramePr>
               <a:graphicFrameLocks noChangeAspect="1"/>
@@ -7083,7 +7075,7 @@
                   <pic:spPr>
                     <a:xfrm>
                       <a:off x="0" y="0"/>
-                      <a:ext cx="5303520" cy="2651760"/>
+                      <a:ext cx="3931920" cy="1965960"/>
                     </a:xfrm>
                     <a:prstGeom prst="rect"/>
                   </pic:spPr>
@@ -7096,7 +7088,8 @@
     </w:p>
     <w:p>
       <w:pPr>
-        <w:spacing w:before="40" w:after="160"/>
+        <w:keepNext/>
+        <w:spacing w:before="20" w:after="100"/>
         <w:jc w:val="center"/>
       </w:pPr>
       <w:r>
@@ -7125,13 +7118,13 @@
     <w:p>
       <w:pPr>
         <w:keepNext/>
-        <w:spacing w:before="160" w:after="60"/>
+        <w:spacing w:before="80" w:after="40"/>
         <w:jc w:val="center"/>
       </w:pPr>
       <w:r>
         <w:drawing>
           <wp:inline xmlns:a="http://schemas.openxmlformats.org/drawingml/2006/main" xmlns:pic="http://schemas.openxmlformats.org/drawingml/2006/picture">
-            <wp:extent cx="5303520" cy="3093720"/>
+            <wp:extent cx="3931920" cy="2293620"/>
             <wp:docPr id="2" name="Picture 2"/>
             <wp:cNvGraphicFramePr>
               <a:graphicFrameLocks noChangeAspect="1"/>
@@ -7152,7 +7145,7 @@
                   <pic:spPr>
                     <a:xfrm>
                       <a:off x="0" y="0"/>
-                      <a:ext cx="5303520" cy="3093720"/>
+                      <a:ext cx="3931920" cy="2293620"/>
                     </a:xfrm>
                     <a:prstGeom prst="rect"/>
                   </pic:spPr>
@@ -7165,7 +7158,8 @@
     </w:p>
     <w:p>
       <w:pPr>
-        <w:spacing w:before="40" w:after="160"/>
+        <w:keepNext/>
+        <w:spacing w:before="20" w:after="100"/>
         <w:jc w:val="center"/>
       </w:pPr>
       <w:r>
@@ -7192,13 +7186,9 @@
       </w:r>
     </w:p>
     <w:p>
-      <w:r>
-        <w:br w:type="page"/>
-      </w:r>
-    </w:p>
-    <w:p>
       <w:pPr>
         <w:keepNext/>
+        <w:pageBreakBefore/>
         <w:spacing w:before="280" w:after="80"/>
         <w:jc w:val="center"/>
       </w:pPr>
@@ -7215,7 +7205,7 @@
     <w:p>
       <w:pPr>
         <w:keepNext/>
-        <w:spacing w:before="180" w:after="60"/>
+        <w:spacing w:before="140" w:after="40"/>
         <w:jc w:val="left"/>
       </w:pPr>
       <w:r>
@@ -8611,7 +8601,7 @@
     <w:p>
       <w:pPr>
         <w:keepNext/>
-        <w:spacing w:before="180" w:after="60"/>
+        <w:spacing w:before="140" w:after="40"/>
         <w:jc w:val="left"/>
       </w:pPr>
       <w:r>
@@ -9301,13 +9291,13 @@
     <w:p>
       <w:pPr>
         <w:keepNext/>
-        <w:spacing w:before="160" w:after="60"/>
+        <w:spacing w:before="80" w:after="40"/>
         <w:jc w:val="center"/>
       </w:pPr>
       <w:r>
         <w:drawing>
           <wp:inline xmlns:a="http://schemas.openxmlformats.org/drawingml/2006/main" xmlns:pic="http://schemas.openxmlformats.org/drawingml/2006/picture">
-            <wp:extent cx="5303520" cy="2410691"/>
+            <wp:extent cx="3931920" cy="1787236"/>
             <wp:docPr id="3" name="Picture 3"/>
             <wp:cNvGraphicFramePr>
               <a:graphicFrameLocks noChangeAspect="1"/>
@@ -9328,7 +9318,7 @@
                   <pic:spPr>
                     <a:xfrm>
                       <a:off x="0" y="0"/>
-                      <a:ext cx="5303520" cy="2410691"/>
+                      <a:ext cx="3931920" cy="1787236"/>
                     </a:xfrm>
                     <a:prstGeom prst="rect"/>
                   </pic:spPr>
@@ -9341,7 +9331,8 @@
     </w:p>
     <w:p>
       <w:pPr>
-        <w:spacing w:before="40" w:after="160"/>
+        <w:keepNext/>
+        <w:spacing w:before="20" w:after="100"/>
         <w:jc w:val="center"/>
       </w:pPr>
       <w:r>
@@ -9370,7 +9361,7 @@
     <w:p>
       <w:pPr>
         <w:keepNext/>
-        <w:spacing w:before="180" w:after="60"/>
+        <w:spacing w:before="140" w:after="40"/>
         <w:jc w:val="left"/>
       </w:pPr>
       <w:r>
@@ -10187,13 +10178,13 @@
     <w:p>
       <w:pPr>
         <w:keepNext/>
-        <w:spacing w:before="160" w:after="60"/>
+        <w:spacing w:before="80" w:after="40"/>
         <w:jc w:val="center"/>
       </w:pPr>
       <w:r>
         <w:drawing>
           <wp:inline xmlns:a="http://schemas.openxmlformats.org/drawingml/2006/main" xmlns:pic="http://schemas.openxmlformats.org/drawingml/2006/picture">
-            <wp:extent cx="5303520" cy="3977640"/>
+            <wp:extent cx="3840480" cy="2880360"/>
             <wp:docPr id="4" name="Picture 4"/>
             <wp:cNvGraphicFramePr>
               <a:graphicFrameLocks noChangeAspect="1"/>
@@ -10214,7 +10205,7 @@
                   <pic:spPr>
                     <a:xfrm>
                       <a:off x="0" y="0"/>
-                      <a:ext cx="5303520" cy="3977640"/>
+                      <a:ext cx="3840480" cy="2880360"/>
                     </a:xfrm>
                     <a:prstGeom prst="rect"/>
                   </pic:spPr>
@@ -10227,7 +10218,8 @@
     </w:p>
     <w:p>
       <w:pPr>
-        <w:spacing w:before="40" w:after="160"/>
+        <w:keepNext/>
+        <w:spacing w:before="20" w:after="100"/>
         <w:jc w:val="center"/>
       </w:pPr>
       <w:r>
@@ -10254,13 +10246,9 @@
       </w:r>
     </w:p>
     <w:p>
-      <w:r>
-        <w:br w:type="page"/>
-      </w:r>
-    </w:p>
-    <w:p>
       <w:pPr>
         <w:keepNext/>
+        <w:pageBreakBefore/>
         <w:spacing w:before="280" w:after="80"/>
         <w:jc w:val="center"/>
       </w:pPr>
@@ -10291,7 +10279,7 @@
     <w:p>
       <w:pPr>
         <w:keepNext/>
-        <w:spacing w:before="180" w:after="60"/>
+        <w:spacing w:before="140" w:after="40"/>
         <w:jc w:val="left"/>
       </w:pPr>
       <w:r>
@@ -11223,76 +11211,7 @@
     <w:p>
       <w:pPr>
         <w:keepNext/>
-        <w:spacing w:before="160" w:after="60"/>
-        <w:jc w:val="center"/>
-      </w:pPr>
-      <w:r>
-        <w:drawing>
-          <wp:inline xmlns:a="http://schemas.openxmlformats.org/drawingml/2006/main" xmlns:pic="http://schemas.openxmlformats.org/drawingml/2006/picture">
-            <wp:extent cx="5303520" cy="2209800"/>
-            <wp:docPr id="5" name="Picture 5"/>
-            <wp:cNvGraphicFramePr>
-              <a:graphicFrameLocks noChangeAspect="1"/>
-            </wp:cNvGraphicFramePr>
-            <a:graphic>
-              <a:graphicData uri="http://schemas.openxmlformats.org/drawingml/2006/picture">
-                <pic:pic>
-                  <pic:nvPicPr>
-                    <pic:cNvPr id="0" name="fig5_roc_pr_curves.png"/>
-                    <pic:cNvPicPr/>
-                  </pic:nvPicPr>
-                  <pic:blipFill>
-                    <a:blip r:embed="rId15"/>
-                    <a:stretch>
-                      <a:fillRect/>
-                    </a:stretch>
-                  </pic:blipFill>
-                  <pic:spPr>
-                    <a:xfrm>
-                      <a:off x="0" y="0"/>
-                      <a:ext cx="5303520" cy="2209800"/>
-                    </a:xfrm>
-                    <a:prstGeom prst="rect"/>
-                  </pic:spPr>
-                </pic:pic>
-              </a:graphicData>
-            </a:graphic>
-          </wp:inline>
-        </w:drawing>
-      </w:r>
-    </w:p>
-    <w:p>
-      <w:pPr>
-        <w:spacing w:before="40" w:after="160"/>
-        <w:jc w:val="center"/>
-      </w:pPr>
-      <w:r>
-        <w:rPr>
-          <w:rFonts w:ascii="Times New Roman" w:hAnsi="Times New Roman"/>
-          <w:color w:val="000000"/>
-          <w:sz w:val="16"/>
-        </w:rPr>
-        <w:t>Fig. 5. Out-of-Sample ROC and Precision-Recall Curves on Embargoed Test Window (2020–2025).</w:t>
-      </w:r>
-    </w:p>
-    <w:p>
-      <w:pPr>
-        <w:spacing w:after="80" w:line="276" w:lineRule="auto"/>
-        <w:jc w:val="both"/>
-      </w:pPr>
-      <w:r>
-        <w:rPr>
-          <w:rFonts w:ascii="Times New Roman" w:hAnsi="Times New Roman"/>
-          <w:color w:val="000000"/>
-          <w:sz w:val="20"/>
-        </w:rPr>
-        <w:t>Figure 5 plots the out-of-sample ROC and Precision-Recall curves across all competing model architectures. The macro-augmented specifications maintain superior true positive rates across all operational false positive thresholds.</w:t>
-      </w:r>
-    </w:p>
-    <w:p>
-      <w:pPr>
-        <w:keepNext/>
-        <w:spacing w:before="180" w:after="60"/>
+        <w:spacing w:before="140" w:after="40"/>
         <w:jc w:val="left"/>
       </w:pPr>
       <w:r>
@@ -12224,13 +12143,101 @@
     <w:p>
       <w:pPr>
         <w:keepNext/>
-        <w:spacing w:before="160" w:after="60"/>
+        <w:pageBreakBefore/>
+        <w:spacing w:before="140" w:after="40"/>
+        <w:jc w:val="left"/>
+      </w:pPr>
+      <w:r>
+        <w:rPr>
+          <w:rFonts w:ascii="Times New Roman" w:hAnsi="Times New Roman"/>
+          <w:b/>
+          <w:i/>
+          <w:color w:val="000000"/>
+          <w:sz w:val="21"/>
+        </w:rPr>
+        <w:t>C. Visual Early-Warning Diagnostics: ROC/PR Curves &amp; Lead Time Distribution</w:t>
+      </w:r>
+    </w:p>
+    <w:p>
+      <w:pPr>
+        <w:keepNext/>
+        <w:spacing w:before="80" w:after="40"/>
         <w:jc w:val="center"/>
       </w:pPr>
       <w:r>
         <w:drawing>
           <wp:inline xmlns:a="http://schemas.openxmlformats.org/drawingml/2006/main" xmlns:pic="http://schemas.openxmlformats.org/drawingml/2006/picture">
-            <wp:extent cx="5303520" cy="2946400"/>
+            <wp:extent cx="4023360" cy="1676400"/>
+            <wp:docPr id="5" name="Picture 5"/>
+            <wp:cNvGraphicFramePr>
+              <a:graphicFrameLocks noChangeAspect="1"/>
+            </wp:cNvGraphicFramePr>
+            <a:graphic>
+              <a:graphicData uri="http://schemas.openxmlformats.org/drawingml/2006/picture">
+                <pic:pic>
+                  <pic:nvPicPr>
+                    <pic:cNvPr id="0" name="fig5_roc_pr_curves.png"/>
+                    <pic:cNvPicPr/>
+                  </pic:nvPicPr>
+                  <pic:blipFill>
+                    <a:blip r:embed="rId15"/>
+                    <a:stretch>
+                      <a:fillRect/>
+                    </a:stretch>
+                  </pic:blipFill>
+                  <pic:spPr>
+                    <a:xfrm>
+                      <a:off x="0" y="0"/>
+                      <a:ext cx="4023360" cy="1676400"/>
+                    </a:xfrm>
+                    <a:prstGeom prst="rect"/>
+                  </pic:spPr>
+                </pic:pic>
+              </a:graphicData>
+            </a:graphic>
+          </wp:inline>
+        </w:drawing>
+      </w:r>
+    </w:p>
+    <w:p>
+      <w:pPr>
+        <w:keepNext/>
+        <w:spacing w:before="20" w:after="100"/>
+        <w:jc w:val="center"/>
+      </w:pPr>
+      <w:r>
+        <w:rPr>
+          <w:rFonts w:ascii="Times New Roman" w:hAnsi="Times New Roman"/>
+          <w:color w:val="000000"/>
+          <w:sz w:val="16"/>
+        </w:rPr>
+        <w:t>Fig. 5. Out-of-Sample ROC and Precision-Recall Curves on Embargoed Test Window (2020–2025).</w:t>
+      </w:r>
+    </w:p>
+    <w:p>
+      <w:pPr>
+        <w:spacing w:after="80" w:line="276" w:lineRule="auto"/>
+        <w:jc w:val="both"/>
+      </w:pPr>
+      <w:r>
+        <w:rPr>
+          <w:rFonts w:ascii="Times New Roman" w:hAnsi="Times New Roman"/>
+          <w:color w:val="000000"/>
+          <w:sz w:val="20"/>
+        </w:rPr>
+        <w:t>Figure 5 plots the out-of-sample ROC and Precision-Recall curves across all competing model architectures. The macro-augmented specifications maintain superior true positive rates across all operational false positive thresholds.</w:t>
+      </w:r>
+    </w:p>
+    <w:p>
+      <w:pPr>
+        <w:keepNext/>
+        <w:spacing w:before="80" w:after="40"/>
+        <w:jc w:val="center"/>
+      </w:pPr>
+      <w:r>
+        <w:drawing>
+          <wp:inline xmlns:a="http://schemas.openxmlformats.org/drawingml/2006/main" xmlns:pic="http://schemas.openxmlformats.org/drawingml/2006/picture">
+            <wp:extent cx="3840480" cy="2133600"/>
             <wp:docPr id="6" name="Picture 6"/>
             <wp:cNvGraphicFramePr>
               <a:graphicFrameLocks noChangeAspect="1"/>
@@ -12251,7 +12258,7 @@
                   <pic:spPr>
                     <a:xfrm>
                       <a:off x="0" y="0"/>
-                      <a:ext cx="5303520" cy="2946400"/>
+                      <a:ext cx="3840480" cy="2133600"/>
                     </a:xfrm>
                     <a:prstGeom prst="rect"/>
                   </pic:spPr>
@@ -12264,7 +12271,8 @@
     </w:p>
     <w:p>
       <w:pPr>
-        <w:spacing w:before="40" w:after="160"/>
+        <w:keepNext/>
+        <w:spacing w:before="20" w:after="100"/>
         <w:jc w:val="center"/>
       </w:pPr>
       <w:r>
@@ -12291,13 +12299,9 @@
       </w:r>
     </w:p>
     <w:p>
-      <w:r>
-        <w:br w:type="page"/>
-      </w:r>
-    </w:p>
-    <w:p>
       <w:pPr>
         <w:keepNext/>
+        <w:pageBreakBefore/>
         <w:spacing w:before="280" w:after="80"/>
         <w:jc w:val="center"/>
       </w:pPr>
@@ -12314,7 +12318,7 @@
     <w:p>
       <w:pPr>
         <w:keepNext/>
-        <w:spacing w:before="180" w:after="60"/>
+        <w:spacing w:before="140" w:after="40"/>
         <w:jc w:val="left"/>
       </w:pPr>
       <w:r>
@@ -14794,13 +14798,13 @@
     <w:p>
       <w:pPr>
         <w:keepNext/>
-        <w:spacing w:before="160" w:after="60"/>
+        <w:spacing w:before="80" w:after="40"/>
         <w:jc w:val="center"/>
       </w:pPr>
       <w:r>
         <w:drawing>
           <wp:inline xmlns:a="http://schemas.openxmlformats.org/drawingml/2006/main" xmlns:pic="http://schemas.openxmlformats.org/drawingml/2006/picture">
-            <wp:extent cx="5303520" cy="2946400"/>
+            <wp:extent cx="3840480" cy="2133600"/>
             <wp:docPr id="7" name="Picture 7"/>
             <wp:cNvGraphicFramePr>
               <a:graphicFrameLocks noChangeAspect="1"/>
@@ -14821,7 +14825,7 @@
                   <pic:spPr>
                     <a:xfrm>
                       <a:off x="0" y="0"/>
-                      <a:ext cx="5303520" cy="2946400"/>
+                      <a:ext cx="3840480" cy="2133600"/>
                     </a:xfrm>
                     <a:prstGeom prst="rect"/>
                   </pic:spPr>
@@ -14834,7 +14838,8 @@
     </w:p>
     <w:p>
       <w:pPr>
-        <w:spacing w:before="40" w:after="160"/>
+        <w:keepNext/>
+        <w:spacing w:before="20" w:after="100"/>
         <w:jc w:val="center"/>
       </w:pPr>
       <w:r>
@@ -14863,13 +14868,13 @@
     <w:p>
       <w:pPr>
         <w:keepNext/>
-        <w:spacing w:before="160" w:after="60"/>
+        <w:spacing w:before="80" w:after="40"/>
         <w:jc w:val="center"/>
       </w:pPr>
       <w:r>
         <w:drawing>
           <wp:inline xmlns:a="http://schemas.openxmlformats.org/drawingml/2006/main" xmlns:pic="http://schemas.openxmlformats.org/drawingml/2006/picture">
-            <wp:extent cx="5303520" cy="2651760"/>
+            <wp:extent cx="3931920" cy="1965960"/>
             <wp:docPr id="8" name="Picture 8"/>
             <wp:cNvGraphicFramePr>
               <a:graphicFrameLocks noChangeAspect="1"/>
@@ -14890,7 +14895,7 @@
                   <pic:spPr>
                     <a:xfrm>
                       <a:off x="0" y="0"/>
-                      <a:ext cx="5303520" cy="2651760"/>
+                      <a:ext cx="3931920" cy="1965960"/>
                     </a:xfrm>
                     <a:prstGeom prst="rect"/>
                   </pic:spPr>
@@ -14903,7 +14908,8 @@
     </w:p>
     <w:p>
       <w:pPr>
-        <w:spacing w:before="40" w:after="160"/>
+        <w:keepNext/>
+        <w:spacing w:before="20" w:after="100"/>
         <w:jc w:val="center"/>
       </w:pPr>
       <w:r>
@@ -14932,7 +14938,7 @@
     <w:p>
       <w:pPr>
         <w:keepNext/>
-        <w:spacing w:before="180" w:after="60"/>
+        <w:spacing w:before="140" w:after="40"/>
         <w:jc w:val="left"/>
       </w:pPr>
       <w:r>
@@ -17085,13 +17091,13 @@
     <w:p>
       <w:pPr>
         <w:keepNext/>
-        <w:spacing w:before="160" w:after="60"/>
+        <w:spacing w:before="80" w:after="40"/>
         <w:jc w:val="center"/>
       </w:pPr>
       <w:r>
         <w:drawing>
           <wp:inline xmlns:a="http://schemas.openxmlformats.org/drawingml/2006/main" xmlns:pic="http://schemas.openxmlformats.org/drawingml/2006/picture">
-            <wp:extent cx="5303520" cy="1835834"/>
+            <wp:extent cx="4206240" cy="1456006"/>
             <wp:docPr id="9" name="Picture 9"/>
             <wp:cNvGraphicFramePr>
               <a:graphicFrameLocks noChangeAspect="1"/>
@@ -17112,7 +17118,7 @@
                   <pic:spPr>
                     <a:xfrm>
                       <a:off x="0" y="0"/>
-                      <a:ext cx="5303520" cy="1835834"/>
+                      <a:ext cx="4206240" cy="1456006"/>
                     </a:xfrm>
                     <a:prstGeom prst="rect"/>
                   </pic:spPr>
@@ -17125,7 +17131,8 @@
     </w:p>
     <w:p>
       <w:pPr>
-        <w:spacing w:before="40" w:after="160"/>
+        <w:keepNext/>
+        <w:spacing w:before="20" w:after="100"/>
         <w:jc w:val="center"/>
       </w:pPr>
       <w:r>
@@ -17152,13 +17159,9 @@
       </w:r>
     </w:p>
     <w:p>
-      <w:r>
-        <w:br w:type="page"/>
-      </w:r>
-    </w:p>
-    <w:p>
       <w:pPr>
         <w:keepNext/>
+        <w:pageBreakBefore/>
         <w:spacing w:before="280" w:after="80"/>
         <w:jc w:val="center"/>
       </w:pPr>
@@ -17235,9 +17238,9 @@
         </w:tblBorders>
       </w:tblPr>
       <w:tblGrid>
-        <w:gridCol w:w="5760"/>
+        <w:gridCol w:w="4608"/>
         <w:gridCol w:w="1584"/>
-        <w:gridCol w:w="2304"/>
+        <w:gridCol w:w="3456"/>
       </w:tblGrid>
       <w:tr>
         <w:trPr>
@@ -17246,13 +17249,13 @@
         </w:trPr>
         <w:tc>
           <w:tcPr>
-            <w:tcW w:type="dxa" w:w="5760"/>
-            <w:tcW w:w="5760" w:type="dxa"/>
+            <w:tcW w:type="dxa" w:w="4608"/>
+            <w:tcW w:w="4608" w:type="dxa"/>
             <w:tcMar>
               <w:top w:w="35" w:type="dxa"/>
               <w:bottom w:w="35" w:type="dxa"/>
-              <w:left w:w="45" w:type="dxa"/>
-              <w:right w:w="45" w:type="dxa"/>
+              <w:left w:w="40" w:type="dxa"/>
+              <w:right w:w="40" w:type="dxa"/>
             </w:tcMar>
             <w:tcBorders>
               <w:bottom w:val="single" w:sz="4" w:space="0" w:color="000000"/>
@@ -17268,7 +17271,7 @@
                 <w:rFonts w:ascii="Times New Roman" w:hAnsi="Times New Roman"/>
                 <w:b/>
                 <w:color w:val="000000"/>
-                <w:sz w:val="16"/>
+                <w:sz w:val="15"/>
               </w:rPr>
               <w:t>Specification / Check</w:t>
             </w:r>
@@ -17281,8 +17284,8 @@
             <w:tcMar>
               <w:top w:w="35" w:type="dxa"/>
               <w:bottom w:w="35" w:type="dxa"/>
-              <w:left w:w="45" w:type="dxa"/>
-              <w:right w:w="45" w:type="dxa"/>
+              <w:left w:w="40" w:type="dxa"/>
+              <w:right w:w="40" w:type="dxa"/>
             </w:tcMar>
             <w:tcBorders>
               <w:bottom w:val="single" w:sz="4" w:space="0" w:color="000000"/>
@@ -17298,7 +17301,7 @@
                 <w:rFonts w:ascii="Times New Roman" w:hAnsi="Times New Roman"/>
                 <w:b/>
                 <w:color w:val="000000"/>
-                <w:sz w:val="16"/>
+                <w:sz w:val="15"/>
               </w:rPr>
               <w:t>ROC-AUC</w:t>
             </w:r>
@@ -17306,13 +17309,13 @@
         </w:tc>
         <w:tc>
           <w:tcPr>
-            <w:tcW w:type="dxa" w:w="2304"/>
-            <w:tcW w:w="2304" w:type="dxa"/>
+            <w:tcW w:type="dxa" w:w="3456"/>
+            <w:tcW w:w="3456" w:type="dxa"/>
             <w:tcMar>
               <w:top w:w="35" w:type="dxa"/>
               <w:bottom w:w="35" w:type="dxa"/>
-              <w:left w:w="45" w:type="dxa"/>
-              <w:right w:w="45" w:type="dxa"/>
+              <w:left w:w="40" w:type="dxa"/>
+              <w:right w:w="40" w:type="dxa"/>
             </w:tcMar>
             <w:tcBorders>
               <w:bottom w:val="single" w:sz="4" w:space="0" w:color="000000"/>
@@ -17328,7 +17331,7 @@
                 <w:rFonts w:ascii="Times New Roman" w:hAnsi="Times New Roman"/>
                 <w:b/>
                 <w:color w:val="000000"/>
-                <w:sz w:val="16"/>
+                <w:sz w:val="15"/>
               </w:rPr>
               <w:t>Status</w:t>
             </w:r>
@@ -17341,13 +17344,13 @@
         </w:trPr>
         <w:tc>
           <w:tcPr>
-            <w:tcW w:type="dxa" w:w="5760"/>
-            <w:tcW w:w="5760" w:type="dxa"/>
+            <w:tcW w:type="dxa" w:w="4608"/>
+            <w:tcW w:w="4608" w:type="dxa"/>
             <w:tcMar>
               <w:top w:w="35" w:type="dxa"/>
               <w:bottom w:w="35" w:type="dxa"/>
-              <w:left w:w="45" w:type="dxa"/>
-              <w:right w:w="45" w:type="dxa"/>
+              <w:left w:w="40" w:type="dxa"/>
+              <w:right w:w="40" w:type="dxa"/>
             </w:tcMar>
           </w:tcPr>
           <w:p>
@@ -17359,7 +17362,7 @@
               <w:rPr>
                 <w:rFonts w:ascii="Times New Roman" w:hAnsi="Times New Roman"/>
                 <w:color w:val="000000"/>
-                <w:sz w:val="16"/>
+                <w:sz w:val="15"/>
               </w:rPr>
               <w:t>Core Model: Macro-Augmented 12M Horizon (Test 2020-2025)</w:t>
             </w:r>
@@ -17372,8 +17375,8 @@
             <w:tcMar>
               <w:top w:w="35" w:type="dxa"/>
               <w:bottom w:w="35" w:type="dxa"/>
-              <w:left w:w="45" w:type="dxa"/>
-              <w:right w:w="45" w:type="dxa"/>
+              <w:left w:w="40" w:type="dxa"/>
+              <w:right w:w="40" w:type="dxa"/>
             </w:tcMar>
           </w:tcPr>
           <w:p>
@@ -17385,7 +17388,7 @@
               <w:rPr>
                 <w:rFonts w:ascii="Times New Roman" w:hAnsi="Times New Roman"/>
                 <w:color w:val="000000"/>
-                <w:sz w:val="16"/>
+                <w:sz w:val="15"/>
               </w:rPr>
               <w:t>0.8019</w:t>
             </w:r>
@@ -17393,13 +17396,13 @@
         </w:tc>
         <w:tc>
           <w:tcPr>
-            <w:tcW w:type="dxa" w:w="2304"/>
-            <w:tcW w:w="2304" w:type="dxa"/>
+            <w:tcW w:type="dxa" w:w="3456"/>
+            <w:tcW w:w="3456" w:type="dxa"/>
             <w:tcMar>
               <w:top w:w="35" w:type="dxa"/>
               <w:bottom w:w="35" w:type="dxa"/>
-              <w:left w:w="45" w:type="dxa"/>
-              <w:right w:w="45" w:type="dxa"/>
+              <w:left w:w="40" w:type="dxa"/>
+              <w:right w:w="40" w:type="dxa"/>
             </w:tcMar>
           </w:tcPr>
           <w:p>
@@ -17411,7 +17414,7 @@
               <w:rPr>
                 <w:rFonts w:ascii="Times New Roman" w:hAnsi="Times New Roman"/>
                 <w:color w:val="000000"/>
-                <w:sz w:val="16"/>
+                <w:sz w:val="15"/>
               </w:rPr>
               <w:t>Baseline Spec</w:t>
             </w:r>
@@ -17424,13 +17427,13 @@
         </w:trPr>
         <w:tc>
           <w:tcPr>
-            <w:tcW w:type="dxa" w:w="5760"/>
-            <w:tcW w:w="5760" w:type="dxa"/>
+            <w:tcW w:type="dxa" w:w="4608"/>
+            <w:tcW w:w="4608" w:type="dxa"/>
             <w:tcMar>
               <w:top w:w="35" w:type="dxa"/>
               <w:bottom w:w="35" w:type="dxa"/>
-              <w:left w:w="45" w:type="dxa"/>
-              <w:right w:w="45" w:type="dxa"/>
+              <w:left w:w="40" w:type="dxa"/>
+              <w:right w:w="40" w:type="dxa"/>
             </w:tcMar>
           </w:tcPr>
           <w:p>
@@ -17442,7 +17445,7 @@
               <w:rPr>
                 <w:rFonts w:ascii="Times New Roman" w:hAnsi="Times New Roman"/>
                 <w:color w:val="000000"/>
-                <w:sz w:val="16"/>
+                <w:sz w:val="15"/>
               </w:rPr>
               <w:t>Alternative Horizon: 2-Quarter (6-Month) Horizon</w:t>
             </w:r>
@@ -17455,8 +17458,8 @@
             <w:tcMar>
               <w:top w:w="35" w:type="dxa"/>
               <w:bottom w:w="35" w:type="dxa"/>
-              <w:left w:w="45" w:type="dxa"/>
-              <w:right w:w="45" w:type="dxa"/>
+              <w:left w:w="40" w:type="dxa"/>
+              <w:right w:w="40" w:type="dxa"/>
             </w:tcMar>
           </w:tcPr>
           <w:p>
@@ -17468,7 +17471,7 @@
               <w:rPr>
                 <w:rFonts w:ascii="Times New Roman" w:hAnsi="Times New Roman"/>
                 <w:color w:val="000000"/>
-                <w:sz w:val="16"/>
+                <w:sz w:val="15"/>
               </w:rPr>
               <w:t>0.8512</w:t>
             </w:r>
@@ -17476,13 +17479,13 @@
         </w:tc>
         <w:tc>
           <w:tcPr>
-            <w:tcW w:type="dxa" w:w="2304"/>
-            <w:tcW w:w="2304" w:type="dxa"/>
+            <w:tcW w:type="dxa" w:w="3456"/>
+            <w:tcW w:w="3456" w:type="dxa"/>
             <w:tcMar>
               <w:top w:w="35" w:type="dxa"/>
               <w:bottom w:w="35" w:type="dxa"/>
-              <w:left w:w="45" w:type="dxa"/>
-              <w:right w:w="45" w:type="dxa"/>
+              <w:left w:w="40" w:type="dxa"/>
+              <w:right w:w="40" w:type="dxa"/>
             </w:tcMar>
           </w:tcPr>
           <w:p>
@@ -17494,7 +17497,7 @@
               <w:rPr>
                 <w:rFonts w:ascii="Times New Roman" w:hAnsi="Times New Roman"/>
                 <w:color w:val="000000"/>
-                <w:sz w:val="16"/>
+                <w:sz w:val="15"/>
               </w:rPr>
               <w:t>Consistent &amp; High Power</w:t>
             </w:r>
@@ -17507,13 +17510,13 @@
         </w:trPr>
         <w:tc>
           <w:tcPr>
-            <w:tcW w:type="dxa" w:w="5760"/>
-            <w:tcW w:w="5760" w:type="dxa"/>
+            <w:tcW w:type="dxa" w:w="4608"/>
+            <w:tcW w:w="4608" w:type="dxa"/>
             <w:tcMar>
               <w:top w:w="35" w:type="dxa"/>
               <w:bottom w:w="35" w:type="dxa"/>
-              <w:left w:w="45" w:type="dxa"/>
-              <w:right w:w="45" w:type="dxa"/>
+              <w:left w:w="40" w:type="dxa"/>
+              <w:right w:w="40" w:type="dxa"/>
             </w:tcMar>
           </w:tcPr>
           <w:p>
@@ -17525,7 +17528,7 @@
               <w:rPr>
                 <w:rFonts w:ascii="Times New Roman" w:hAnsi="Times New Roman"/>
                 <w:color w:val="000000"/>
-                <w:sz w:val="16"/>
+                <w:sz w:val="15"/>
               </w:rPr>
               <w:t>Alternative Horizon: 8-Quarter (24-Month) Horizon</w:t>
             </w:r>
@@ -17538,8 +17541,8 @@
             <w:tcMar>
               <w:top w:w="35" w:type="dxa"/>
               <w:bottom w:w="35" w:type="dxa"/>
-              <w:left w:w="45" w:type="dxa"/>
-              <w:right w:w="45" w:type="dxa"/>
+              <w:left w:w="40" w:type="dxa"/>
+              <w:right w:w="40" w:type="dxa"/>
             </w:tcMar>
           </w:tcPr>
           <w:p>
@@ -17551,7 +17554,7 @@
               <w:rPr>
                 <w:rFonts w:ascii="Times New Roman" w:hAnsi="Times New Roman"/>
                 <w:color w:val="000000"/>
-                <w:sz w:val="16"/>
+                <w:sz w:val="15"/>
               </w:rPr>
               <w:t>0.8045</w:t>
             </w:r>
@@ -17559,13 +17562,13 @@
         </w:tc>
         <w:tc>
           <w:tcPr>
-            <w:tcW w:type="dxa" w:w="2304"/>
-            <w:tcW w:w="2304" w:type="dxa"/>
+            <w:tcW w:type="dxa" w:w="3456"/>
+            <w:tcW w:w="3456" w:type="dxa"/>
             <w:tcMar>
               <w:top w:w="35" w:type="dxa"/>
               <w:bottom w:w="35" w:type="dxa"/>
-              <w:left w:w="45" w:type="dxa"/>
-              <w:right w:w="45" w:type="dxa"/>
+              <w:left w:w="40" w:type="dxa"/>
+              <w:right w:w="40" w:type="dxa"/>
             </w:tcMar>
           </w:tcPr>
           <w:p>
@@ -17577,7 +17580,7 @@
               <w:rPr>
                 <w:rFonts w:ascii="Times New Roman" w:hAnsi="Times New Roman"/>
                 <w:color w:val="000000"/>
-                <w:sz w:val="16"/>
+                <w:sz w:val="15"/>
               </w:rPr>
               <w:t>Mean Reversion Observed</w:t>
             </w:r>
@@ -17590,13 +17593,13 @@
         </w:trPr>
         <w:tc>
           <w:tcPr>
-            <w:tcW w:type="dxa" w:w="5760"/>
-            <w:tcW w:w="5760" w:type="dxa"/>
+            <w:tcW w:type="dxa" w:w="4608"/>
+            <w:tcW w:w="4608" w:type="dxa"/>
             <w:tcMar>
               <w:top w:w="35" w:type="dxa"/>
               <w:bottom w:w="35" w:type="dxa"/>
-              <w:left w:w="45" w:type="dxa"/>
-              <w:right w:w="45" w:type="dxa"/>
+              <w:left w:w="40" w:type="dxa"/>
+              <w:right w:w="40" w:type="dxa"/>
             </w:tcMar>
           </w:tcPr>
           <w:p>
@@ -17608,7 +17611,7 @@
               <w:rPr>
                 <w:rFonts w:ascii="Times New Roman" w:hAnsi="Times New Roman"/>
                 <w:color w:val="000000"/>
-                <w:sz w:val="16"/>
+                <w:sz w:val="15"/>
               </w:rPr>
               <w:t>Subsample Check: Exclude 2008-2009 Global Financial Crisis</w:t>
             </w:r>
@@ -17621,8 +17624,8 @@
             <w:tcMar>
               <w:top w:w="35" w:type="dxa"/>
               <w:bottom w:w="35" w:type="dxa"/>
-              <w:left w:w="45" w:type="dxa"/>
-              <w:right w:w="45" w:type="dxa"/>
+              <w:left w:w="40" w:type="dxa"/>
+              <w:right w:w="40" w:type="dxa"/>
             </w:tcMar>
           </w:tcPr>
           <w:p>
@@ -17634,7 +17637,7 @@
               <w:rPr>
                 <w:rFonts w:ascii="Times New Roman" w:hAnsi="Times New Roman"/>
                 <w:color w:val="000000"/>
-                <w:sz w:val="16"/>
+                <w:sz w:val="15"/>
               </w:rPr>
               <w:t>0.8240</w:t>
             </w:r>
@@ -17642,13 +17645,13 @@
         </w:tc>
         <w:tc>
           <w:tcPr>
-            <w:tcW w:type="dxa" w:w="2304"/>
-            <w:tcW w:w="2304" w:type="dxa"/>
+            <w:tcW w:type="dxa" w:w="3456"/>
+            <w:tcW w:w="3456" w:type="dxa"/>
             <w:tcMar>
               <w:top w:w="35" w:type="dxa"/>
               <w:bottom w:w="35" w:type="dxa"/>
-              <w:left w:w="45" w:type="dxa"/>
-              <w:right w:w="45" w:type="dxa"/>
+              <w:left w:w="40" w:type="dxa"/>
+              <w:right w:w="40" w:type="dxa"/>
             </w:tcMar>
           </w:tcPr>
           <w:p>
@@ -17660,7 +17663,7 @@
               <w:rPr>
                 <w:rFonts w:ascii="Times New Roman" w:hAnsi="Times New Roman"/>
                 <w:color w:val="000000"/>
-                <w:sz w:val="16"/>
+                <w:sz w:val="15"/>
               </w:rPr>
               <w:t>Robust (No Crisis Overfitting)</w:t>
             </w:r>
@@ -17673,13 +17676,13 @@
         </w:trPr>
         <w:tc>
           <w:tcPr>
-            <w:tcW w:type="dxa" w:w="5760"/>
-            <w:tcW w:w="5760" w:type="dxa"/>
+            <w:tcW w:type="dxa" w:w="4608"/>
+            <w:tcW w:w="4608" w:type="dxa"/>
             <w:tcMar>
               <w:top w:w="35" w:type="dxa"/>
               <w:bottom w:w="35" w:type="dxa"/>
-              <w:left w:w="45" w:type="dxa"/>
-              <w:right w:w="45" w:type="dxa"/>
+              <w:left w:w="40" w:type="dxa"/>
+              <w:right w:w="40" w:type="dxa"/>
             </w:tcMar>
           </w:tcPr>
           <w:p>
@@ -17691,7 +17694,7 @@
               <w:rPr>
                 <w:rFonts w:ascii="Times New Roman" w:hAnsi="Times New Roman"/>
                 <w:color w:val="000000"/>
-                <w:sz w:val="16"/>
+                <w:sz w:val="15"/>
               </w:rPr>
               <w:t>Subsample Check: Exclude 2020 COVID Shock Window</w:t>
             </w:r>
@@ -17704,8 +17707,8 @@
             <w:tcMar>
               <w:top w:w="35" w:type="dxa"/>
               <w:bottom w:w="35" w:type="dxa"/>
-              <w:left w:w="45" w:type="dxa"/>
-              <w:right w:w="45" w:type="dxa"/>
+              <w:left w:w="40" w:type="dxa"/>
+              <w:right w:w="40" w:type="dxa"/>
             </w:tcMar>
           </w:tcPr>
           <w:p>
@@ -17717,7 +17720,7 @@
               <w:rPr>
                 <w:rFonts w:ascii="Times New Roman" w:hAnsi="Times New Roman"/>
                 <w:color w:val="000000"/>
-                <w:sz w:val="16"/>
+                <w:sz w:val="15"/>
               </w:rPr>
               <w:t>0.8315</w:t>
             </w:r>
@@ -17725,13 +17728,13 @@
         </w:tc>
         <w:tc>
           <w:tcPr>
-            <w:tcW w:type="dxa" w:w="2304"/>
-            <w:tcW w:w="2304" w:type="dxa"/>
+            <w:tcW w:type="dxa" w:w="3456"/>
+            <w:tcW w:w="3456" w:type="dxa"/>
             <w:tcMar>
               <w:top w:w="35" w:type="dxa"/>
               <w:bottom w:w="35" w:type="dxa"/>
-              <w:left w:w="45" w:type="dxa"/>
-              <w:right w:w="45" w:type="dxa"/>
+              <w:left w:w="40" w:type="dxa"/>
+              <w:right w:w="40" w:type="dxa"/>
             </w:tcMar>
           </w:tcPr>
           <w:p>
@@ -17743,7 +17746,7 @@
               <w:rPr>
                 <w:rFonts w:ascii="Times New Roman" w:hAnsi="Times New Roman"/>
                 <w:color w:val="000000"/>
-                <w:sz w:val="16"/>
+                <w:sz w:val="15"/>
               </w:rPr>
               <w:t>Robust (Tightening Power Intact)</w:t>
             </w:r>
@@ -17756,13 +17759,13 @@
         </w:trPr>
         <w:tc>
           <w:tcPr>
-            <w:tcW w:type="dxa" w:w="5760"/>
-            <w:tcW w:w="5760" w:type="dxa"/>
+            <w:tcW w:type="dxa" w:w="4608"/>
+            <w:tcW w:w="4608" w:type="dxa"/>
             <w:tcMar>
               <w:top w:w="35" w:type="dxa"/>
               <w:bottom w:w="35" w:type="dxa"/>
-              <w:left w:w="45" w:type="dxa"/>
-              <w:right w:w="45" w:type="dxa"/>
+              <w:left w:w="40" w:type="dxa"/>
+              <w:right w:w="40" w:type="dxa"/>
             </w:tcMar>
           </w:tcPr>
           <w:p>
@@ -17774,7 +17777,7 @@
               <w:rPr>
                 <w:rFonts w:ascii="Times New Roman" w:hAnsi="Times New Roman"/>
                 <w:color w:val="000000"/>
-                <w:sz w:val="16"/>
+                <w:sz w:val="15"/>
               </w:rPr>
               <w:t>Clustered Standard Errors (Double Firm &amp; Quarter Clustered)</w:t>
             </w:r>
@@ -17787,8 +17790,8 @@
             <w:tcMar>
               <w:top w:w="35" w:type="dxa"/>
               <w:bottom w:w="35" w:type="dxa"/>
-              <w:left w:w="45" w:type="dxa"/>
-              <w:right w:w="45" w:type="dxa"/>
+              <w:left w:w="40" w:type="dxa"/>
+              <w:right w:w="40" w:type="dxa"/>
             </w:tcMar>
           </w:tcPr>
           <w:p>
@@ -17800,7 +17803,7 @@
               <w:rPr>
                 <w:rFonts w:ascii="Times New Roman" w:hAnsi="Times New Roman"/>
                 <w:color w:val="000000"/>
-                <w:sz w:val="16"/>
+                <w:sz w:val="15"/>
               </w:rPr>
               <w:t>0.8019</w:t>
             </w:r>
@@ -17808,13 +17811,13 @@
         </w:tc>
         <w:tc>
           <w:tcPr>
-            <w:tcW w:type="dxa" w:w="2304"/>
-            <w:tcW w:w="2304" w:type="dxa"/>
+            <w:tcW w:type="dxa" w:w="3456"/>
+            <w:tcW w:w="3456" w:type="dxa"/>
             <w:tcMar>
               <w:top w:w="35" w:type="dxa"/>
               <w:bottom w:w="35" w:type="dxa"/>
-              <w:left w:w="45" w:type="dxa"/>
-              <w:right w:w="45" w:type="dxa"/>
+              <w:left w:w="40" w:type="dxa"/>
+              <w:right w:w="40" w:type="dxa"/>
             </w:tcMar>
           </w:tcPr>
           <w:p>
@@ -17826,7 +17829,7 @@
               <w:rPr>
                 <w:rFonts w:ascii="Times New Roman" w:hAnsi="Times New Roman"/>
                 <w:color w:val="000000"/>
-                <w:sz w:val="16"/>
+                <w:sz w:val="15"/>
               </w:rPr>
               <w:t>All Key Regressors p &lt; 0.01</w:t>
             </w:r>
@@ -17839,13 +17842,13 @@
         </w:trPr>
         <w:tc>
           <w:tcPr>
-            <w:tcW w:type="dxa" w:w="5760"/>
-            <w:tcW w:w="5760" w:type="dxa"/>
+            <w:tcW w:type="dxa" w:w="4608"/>
+            <w:tcW w:w="4608" w:type="dxa"/>
             <w:tcMar>
               <w:top w:w="35" w:type="dxa"/>
               <w:bottom w:w="35" w:type="dxa"/>
-              <w:left w:w="45" w:type="dxa"/>
-              <w:right w:w="45" w:type="dxa"/>
+              <w:left w:w="40" w:type="dxa"/>
+              <w:right w:w="40" w:type="dxa"/>
             </w:tcMar>
           </w:tcPr>
           <w:p>
@@ -17857,7 +17860,7 @@
               <w:rPr>
                 <w:rFonts w:ascii="Times New Roman" w:hAnsi="Times New Roman"/>
                 <w:color w:val="000000"/>
-                <w:sz w:val="16"/>
+                <w:sz w:val="15"/>
               </w:rPr>
               <w:t>Placebo Test: Time-Permuted Macro Regressors</w:t>
             </w:r>
@@ -17870,8 +17873,8 @@
             <w:tcMar>
               <w:top w:w="35" w:type="dxa"/>
               <w:bottom w:w="35" w:type="dxa"/>
-              <w:left w:w="45" w:type="dxa"/>
-              <w:right w:w="45" w:type="dxa"/>
+              <w:left w:w="40" w:type="dxa"/>
+              <w:right w:w="40" w:type="dxa"/>
             </w:tcMar>
           </w:tcPr>
           <w:p>
@@ -17883,7 +17886,7 @@
               <w:rPr>
                 <w:rFonts w:ascii="Times New Roman" w:hAnsi="Times New Roman"/>
                 <w:color w:val="000000"/>
-                <w:sz w:val="16"/>
+                <w:sz w:val="15"/>
               </w:rPr>
               <w:t>0.8043</w:t>
             </w:r>
@@ -17891,13 +17894,13 @@
         </w:tc>
         <w:tc>
           <w:tcPr>
-            <w:tcW w:type="dxa" w:w="2304"/>
-            <w:tcW w:w="2304" w:type="dxa"/>
+            <w:tcW w:type="dxa" w:w="3456"/>
+            <w:tcW w:w="3456" w:type="dxa"/>
             <w:tcMar>
               <w:top w:w="35" w:type="dxa"/>
               <w:bottom w:w="35" w:type="dxa"/>
-              <w:left w:w="45" w:type="dxa"/>
-              <w:right w:w="45" w:type="dxa"/>
+              <w:left w:w="40" w:type="dxa"/>
+              <w:right w:w="40" w:type="dxa"/>
             </w:tcMar>
           </w:tcPr>
           <w:p>
@@ -17909,7 +17912,7 @@
               <w:rPr>
                 <w:rFonts w:ascii="Times New Roman" w:hAnsi="Times New Roman"/>
                 <w:color w:val="000000"/>
-                <w:sz w:val="16"/>
+                <w:sz w:val="15"/>
               </w:rPr>
               <w:t>Gain Vanishes (Matches Firm-Only)</w:t>
             </w:r>
@@ -17922,13 +17925,13 @@
         </w:trPr>
         <w:tc>
           <w:tcPr>
-            <w:tcW w:type="dxa" w:w="5760"/>
-            <w:tcW w:w="5760" w:type="dxa"/>
+            <w:tcW w:type="dxa" w:w="4608"/>
+            <w:tcW w:w="4608" w:type="dxa"/>
             <w:tcMar>
               <w:top w:w="35" w:type="dxa"/>
               <w:bottom w:w="35" w:type="dxa"/>
-              <w:left w:w="45" w:type="dxa"/>
-              <w:right w:w="45" w:type="dxa"/>
+              <w:left w:w="40" w:type="dxa"/>
+              <w:right w:w="40" w:type="dxa"/>
             </w:tcMar>
           </w:tcPr>
           <w:p>
@@ -17940,7 +17943,7 @@
               <w:rPr>
                 <w:rFonts w:ascii="Times New Roman" w:hAnsi="Times New Roman"/>
                 <w:color w:val="000000"/>
-                <w:sz w:val="16"/>
+                <w:sz w:val="15"/>
               </w:rPr>
               <w:t>Negative Control: Shuffled Target Labels</w:t>
             </w:r>
@@ -17953,8 +17956,8 @@
             <w:tcMar>
               <w:top w:w="35" w:type="dxa"/>
               <w:bottom w:w="35" w:type="dxa"/>
-              <w:left w:w="45" w:type="dxa"/>
-              <w:right w:w="45" w:type="dxa"/>
+              <w:left w:w="40" w:type="dxa"/>
+              <w:right w:w="40" w:type="dxa"/>
             </w:tcMar>
           </w:tcPr>
           <w:p>
@@ -17966,7 +17969,7 @@
               <w:rPr>
                 <w:rFonts w:ascii="Times New Roman" w:hAnsi="Times New Roman"/>
                 <w:color w:val="000000"/>
-                <w:sz w:val="16"/>
+                <w:sz w:val="15"/>
               </w:rPr>
               <w:t>0.5036</w:t>
             </w:r>
@@ -17974,13 +17977,13 @@
         </w:tc>
         <w:tc>
           <w:tcPr>
-            <w:tcW w:type="dxa" w:w="2304"/>
-            <w:tcW w:w="2304" w:type="dxa"/>
+            <w:tcW w:type="dxa" w:w="3456"/>
+            <w:tcW w:w="3456" w:type="dxa"/>
             <w:tcMar>
               <w:top w:w="35" w:type="dxa"/>
               <w:bottom w:w="35" w:type="dxa"/>
-              <w:left w:w="45" w:type="dxa"/>
-              <w:right w:w="45" w:type="dxa"/>
+              <w:left w:w="40" w:type="dxa"/>
+              <w:right w:w="40" w:type="dxa"/>
             </w:tcMar>
           </w:tcPr>
           <w:p>
@@ -17992,7 +17995,7 @@
               <w:rPr>
                 <w:rFonts w:ascii="Times New Roman" w:hAnsi="Times New Roman"/>
                 <w:color w:val="000000"/>
-                <w:sz w:val="16"/>
+                <w:sz w:val="15"/>
               </w:rPr>
               <w:t>No Spurious Correlation (AUC = 0.50)</w:t>
             </w:r>
@@ -18073,13 +18076,13 @@
     <w:p>
       <w:pPr>
         <w:keepNext/>
-        <w:spacing w:before="160" w:after="60"/>
+        <w:spacing w:before="80" w:after="40"/>
         <w:jc w:val="center"/>
       </w:pPr>
       <w:r>
         <w:drawing>
           <wp:inline xmlns:a="http://schemas.openxmlformats.org/drawingml/2006/main" xmlns:pic="http://schemas.openxmlformats.org/drawingml/2006/picture">
-            <wp:extent cx="5303520" cy="2946400"/>
+            <wp:extent cx="3931920" cy="2184400"/>
             <wp:docPr id="10" name="Picture 10"/>
             <wp:cNvGraphicFramePr>
               <a:graphicFrameLocks noChangeAspect="1"/>
@@ -18100,7 +18103,7 @@
                   <pic:spPr>
                     <a:xfrm>
                       <a:off x="0" y="0"/>
-                      <a:ext cx="5303520" cy="2946400"/>
+                      <a:ext cx="3931920" cy="2184400"/>
                     </a:xfrm>
                     <a:prstGeom prst="rect"/>
                   </pic:spPr>
@@ -18113,7 +18116,8 @@
     </w:p>
     <w:p>
       <w:pPr>
-        <w:spacing w:before="40" w:after="160"/>
+        <w:keepNext/>
+        <w:spacing w:before="20" w:after="100"/>
         <w:jc w:val="center"/>
       </w:pPr>
       <w:r>
@@ -18140,13 +18144,9 @@
       </w:r>
     </w:p>
     <w:p>
-      <w:r>
-        <w:br w:type="page"/>
-      </w:r>
-    </w:p>
-    <w:p>
       <w:pPr>
         <w:keepNext/>
+        <w:pageBreakBefore/>
         <w:spacing w:before="280" w:after="80"/>
         <w:jc w:val="center"/>
       </w:pPr>
@@ -18177,7 +18177,7 @@
     <w:p>
       <w:pPr>
         <w:keepNext/>
-        <w:spacing w:before="180" w:after="60"/>
+        <w:spacing w:before="140" w:after="40"/>
         <w:jc w:val="left"/>
       </w:pPr>
       <w:r>
@@ -18208,7 +18208,7 @@
     <w:p>
       <w:pPr>
         <w:keepNext/>
-        <w:spacing w:before="180" w:after="60"/>
+        <w:spacing w:before="140" w:after="40"/>
         <w:jc w:val="left"/>
       </w:pPr>
       <w:r>
@@ -18237,13 +18237,9 @@
       </w:r>
     </w:p>
     <w:p>
-      <w:r>
-        <w:br w:type="page"/>
-      </w:r>
-    </w:p>
-    <w:p>
       <w:pPr>
         <w:keepNext/>
+        <w:pageBreakBefore/>
         <w:spacing w:before="280" w:after="80"/>
         <w:jc w:val="center"/>
       </w:pPr>
@@ -18380,13 +18376,9 @@
       </w:r>
     </w:p>
     <w:p>
-      <w:r>
-        <w:br w:type="page"/>
-      </w:r>
-    </w:p>
-    <w:p>
       <w:pPr>
         <w:keepNext/>
+        <w:pageBreakBefore/>
         <w:spacing w:before="280" w:after="80"/>
         <w:jc w:val="center"/>
       </w:pPr>
@@ -18403,7 +18395,7 @@
     <w:p>
       <w:pPr>
         <w:keepNext/>
-        <w:spacing w:before="180" w:after="60"/>
+        <w:spacing w:before="140" w:after="40"/>
         <w:jc w:val="left"/>
       </w:pPr>
       <w:r>
@@ -18457,7 +18449,7 @@
           </w:tcPr>
           <w:p>
             <w:pPr>
-              <w:spacing w:before="80" w:after="80"/>
+              <w:spacing w:before="40" w:after="40"/>
               <w:jc w:val="center"/>
             </w:pPr>
             <m:oMath>
@@ -18535,7 +18527,7 @@
           </w:tcPr>
           <w:p>
             <w:pPr>
-              <w:spacing w:before="80" w:after="80"/>
+              <w:spacing w:before="40" w:after="40"/>
               <w:jc w:val="right"/>
             </w:pPr>
             <w:r>
@@ -18608,7 +18600,7 @@
           </w:tcPr>
           <w:p>
             <w:pPr>
-              <w:spacing w:before="80" w:after="80"/>
+              <w:spacing w:before="40" w:after="40"/>
               <w:jc w:val="center"/>
             </w:pPr>
             <m:oMath>
@@ -18875,7 +18867,7 @@
           </w:tcPr>
           <w:p>
             <w:pPr>
-              <w:spacing w:before="80" w:after="80"/>
+              <w:spacing w:before="40" w:after="40"/>
               <w:jc w:val="right"/>
             </w:pPr>
             <w:r>
@@ -18959,7 +18951,7 @@
           </w:tcPr>
           <w:p>
             <w:pPr>
-              <w:spacing w:before="80" w:after="80"/>
+              <w:spacing w:before="40" w:after="40"/>
               <w:jc w:val="center"/>
             </w:pPr>
             <m:oMath>
@@ -19186,7 +19178,7 @@
           </w:tcPr>
           <w:p>
             <w:pPr>
-              <w:spacing w:before="80" w:after="80"/>
+              <w:spacing w:before="40" w:after="40"/>
               <w:jc w:val="right"/>
             </w:pPr>
             <w:r>
@@ -19204,7 +19196,7 @@
     <w:p>
       <w:pPr>
         <w:keepNext/>
-        <w:spacing w:before="180" w:after="60"/>
+        <w:spacing w:before="140" w:after="40"/>
         <w:jc w:val="left"/>
       </w:pPr>
       <w:r>
@@ -19416,7 +19408,7 @@
           </w:tcPr>
           <w:p>
             <w:pPr>
-              <w:spacing w:before="80" w:after="80"/>
+              <w:spacing w:before="40" w:after="40"/>
               <w:jc w:val="center"/>
             </w:pPr>
             <m:oMath>
@@ -19608,7 +19600,7 @@
           </w:tcPr>
           <w:p>
             <w:pPr>
-              <w:spacing w:before="80" w:after="80"/>
+              <w:spacing w:before="40" w:after="40"/>
               <w:jc w:val="right"/>
             </w:pPr>
             <w:r>
@@ -19626,7 +19618,7 @@
     <w:p>
       <w:pPr>
         <w:keepNext/>
-        <w:spacing w:before="180" w:after="60"/>
+        <w:spacing w:before="140" w:after="40"/>
         <w:jc w:val="left"/>
       </w:pPr>
       <w:r>
@@ -19680,7 +19672,7 @@
           </w:tcPr>
           <w:p>
             <w:pPr>
-              <w:spacing w:before="80" w:after="80"/>
+              <w:spacing w:before="40" w:after="40"/>
               <w:jc w:val="center"/>
             </w:pPr>
             <m:oMath>
@@ -19714,7 +19706,7 @@
           </w:tcPr>
           <w:p>
             <w:pPr>
-              <w:spacing w:before="80" w:after="80"/>
+              <w:spacing w:before="40" w:after="40"/>
               <w:jc w:val="right"/>
             </w:pPr>
             <w:r>
@@ -19769,7 +19761,7 @@
           </w:tcPr>
           <w:p>
             <w:pPr>
-              <w:spacing w:before="80" w:after="80"/>
+              <w:spacing w:before="40" w:after="40"/>
               <w:jc w:val="center"/>
             </w:pPr>
             <m:oMath>
@@ -19823,7 +19815,7 @@
           </w:tcPr>
           <w:p>
             <w:pPr>
-              <w:spacing w:before="80" w:after="80"/>
+              <w:spacing w:before="40" w:after="40"/>
               <w:jc w:val="right"/>
             </w:pPr>
             <w:r>
@@ -20046,7 +20038,7 @@
           </w:tcPr>
           <w:p>
             <w:pPr>
-              <w:spacing w:before="80" w:after="80"/>
+              <w:spacing w:before="40" w:after="40"/>
               <w:jc w:val="center"/>
             </w:pPr>
             <m:oMath>
@@ -20164,7 +20156,7 @@
           </w:tcPr>
           <w:p>
             <w:pPr>
-              <w:spacing w:before="80" w:after="80"/>
+              <w:spacing w:before="40" w:after="40"/>
               <w:jc w:val="right"/>
             </w:pPr>
             <w:r>
@@ -20370,7 +20362,7 @@
     <w:p>
       <w:pPr>
         <w:keepNext/>
-        <w:spacing w:before="180" w:after="60"/>
+        <w:spacing w:before="140" w:after="40"/>
         <w:jc w:val="left"/>
       </w:pPr>
       <w:r>
@@ -20424,7 +20416,7 @@
           </w:tcPr>
           <w:p>
             <w:pPr>
-              <w:spacing w:before="80" w:after="80"/>
+              <w:spacing w:before="40" w:after="40"/>
               <w:jc w:val="center"/>
             </w:pPr>
             <m:oMath>
@@ -20566,7 +20558,7 @@
           </w:tcPr>
           <w:p>
             <w:pPr>
-              <w:spacing w:before="80" w:after="80"/>
+              <w:spacing w:before="40" w:after="40"/>
               <w:jc w:val="right"/>
             </w:pPr>
             <w:r>
@@ -20639,7 +20631,7 @@
           </w:tcPr>
           <w:p>
             <w:pPr>
-              <w:spacing w:before="80" w:after="80"/>
+              <w:spacing w:before="40" w:after="40"/>
               <w:jc w:val="center"/>
             </w:pPr>
             <m:oMath>
@@ -20749,7 +20741,7 @@
           </w:tcPr>
           <w:p>
             <w:pPr>
-              <w:spacing w:before="80" w:after="80"/>
+              <w:spacing w:before="40" w:after="40"/>
               <w:jc w:val="right"/>
             </w:pPr>
             <w:r>
@@ -20822,7 +20814,7 @@
           </w:tcPr>
           <w:p>
             <w:pPr>
-              <w:spacing w:before="80" w:after="80"/>
+              <w:spacing w:before="40" w:after="40"/>
               <w:jc w:val="center"/>
             </w:pPr>
             <m:oMath>
@@ -20874,7 +20866,7 @@
           </w:tcPr>
           <w:p>
             <w:pPr>
-              <w:spacing w:before="80" w:after="80"/>
+              <w:spacing w:before="40" w:after="40"/>
               <w:jc w:val="right"/>
             </w:pPr>
             <w:r>
@@ -20987,7 +20979,7 @@
           </w:tcPr>
           <w:p>
             <w:pPr>
-              <w:spacing w:before="80" w:after="80"/>
+              <w:spacing w:before="40" w:after="40"/>
               <w:jc w:val="center"/>
             </w:pPr>
             <m:oMath>
@@ -21042,7 +21034,7 @@
           </w:tcPr>
           <w:p>
             <w:pPr>
-              <w:spacing w:before="80" w:after="80"/>
+              <w:spacing w:before="40" w:after="40"/>
               <w:jc w:val="right"/>
             </w:pPr>
             <w:r>
@@ -21097,7 +21089,7 @@
           </w:tcPr>
           <w:p>
             <w:pPr>
-              <w:spacing w:before="80" w:after="80"/>
+              <w:spacing w:before="40" w:after="40"/>
               <w:jc w:val="center"/>
             </w:pPr>
             <m:oMath>
@@ -21194,7 +21186,7 @@
           </w:tcPr>
           <w:p>
             <w:pPr>
-              <w:spacing w:before="80" w:after="80"/>
+              <w:spacing w:before="40" w:after="40"/>
               <w:jc w:val="right"/>
             </w:pPr>
             <w:r>
@@ -21210,13 +21202,9 @@
       </w:tr>
     </w:tbl>
     <w:p>
-      <w:r>
-        <w:br w:type="page"/>
-      </w:r>
-    </w:p>
-    <w:p>
       <w:pPr>
         <w:keepNext/>
+        <w:pageBreakBefore/>
         <w:spacing w:before="280" w:after="80"/>
         <w:jc w:val="center"/>
       </w:pPr>
@@ -21676,7 +21664,7 @@
         <w:color w:val="000000"/>
         <w:sz w:val="17"/>
       </w:rPr>
-      <w:t>QUANTITATIVE ANALYSIS OF FINANCIAL MARKETS | SMU MSc Quantitative Finance</w:t>
+      <w:t>Quantitative Analysis of Financial Markets</w:t>
     </w:r>
     <w:r>
       <w:rPr>

</xml_diff>